<commit_message>
Adds a few revisions
</commit_message>
<xml_diff>
--- a/static/downloads/cruzresume.docx
+++ b/static/downloads/cruzresume.docx
@@ -14,6 +14,16 @@
       </w:pPr>
       <w:r>
         <w:rPr>
+          <w:rFonts w:ascii="Arial Unicode MS" w:cs="Arial Unicode MS" w:hAnsi="Arial Unicode MS" w:eastAsia="Arial Unicode MS"/>
+          <w:b w:val="0"/>
+          <w:bCs w:val="0"/>
+          <w:i w:val="0"/>
+          <w:iCs w:val="0"/>
+        </w:rPr>
+        <w:br w:type="textWrapping"/>
+      </w:r>
+      <w:r>
+        <w:rPr>
           <w:rFonts w:ascii="Times" w:hAnsi="Times"/>
           <w:b w:val="1"/>
           <w:bCs w:val="1"/>
@@ -36,7 +46,37 @@
           <w:rtl w:val="0"/>
           <w:lang w:val="en-US"/>
         </w:rPr>
-        <w:t>Software developer with over 10 years of demonstrated experience and a special interest in JavaScript. Offers great communication and leadership skills. Always hungry to learn more.</w:t>
+        <w:t>Senior software developer with over 10 years of demonstrated experience and a penchant for managing development teams. I have a special interest in JavaScript and offer great communication and leadership skills</w:t>
+      </w:r>
+      <w:r>
+        <w:rPr>
+          <w:rFonts w:ascii="Times" w:hAnsi="Times" w:hint="default"/>
+          <w:rtl w:val="0"/>
+          <w:lang w:val="en-US"/>
+        </w:rPr>
+        <w:t>—</w:t>
+      </w:r>
+      <w:r>
+        <w:rPr>
+          <w:rFonts w:ascii="Times" w:hAnsi="Times"/>
+          <w:rtl w:val="0"/>
+        </w:rPr>
+        <w:t>I</w:t>
+      </w:r>
+      <w:r>
+        <w:rPr>
+          <w:rFonts w:ascii="Times" w:hAnsi="Times" w:hint="default"/>
+          <w:rtl w:val="0"/>
+        </w:rPr>
+        <w:t>’</w:t>
+      </w:r>
+      <w:r>
+        <w:rPr>
+          <w:rFonts w:ascii="Times" w:hAnsi="Times"/>
+          <w:rtl w:val="0"/>
+          <w:lang w:val="en-US"/>
+        </w:rPr>
+        <w:t>m always hungry to learn more.</w:t>
       </w:r>
     </w:p>
     <w:p>
@@ -335,6 +375,14 @@
         </w:rPr>
         <w:t>Created and maintained Single Page Applications</w:t>
       </w:r>
+      <w:r>
+        <w:rPr>
+          <w:rFonts w:ascii="Times" w:hAnsi="Times"/>
+          <w:rtl w:val="0"/>
+          <w:lang w:val="en-US"/>
+        </w:rPr>
+        <w:t xml:space="preserve"> using React</w:t>
+      </w:r>
     </w:p>
     <w:p>
       <w:pPr>
@@ -425,7 +473,22 @@
           <w:rtl w:val="0"/>
           <w:lang w:val="en-US"/>
         </w:rPr>
-        <w:t>Produced and presented content for courses on technologies such as React &amp; Angular (v.2+)</w:t>
+        <w:t>Produced and presented content for courses on technologies such as React &amp; Angular (v.</w:t>
+      </w:r>
+      <w:r>
+        <w:rPr>
+          <w:rFonts w:ascii="Times" w:hAnsi="Times"/>
+          <w:rtl w:val="0"/>
+          <w:lang w:val="en-US"/>
+        </w:rPr>
+        <w:t xml:space="preserve"> </w:t>
+      </w:r>
+      <w:r>
+        <w:rPr>
+          <w:rFonts w:ascii="Times" w:hAnsi="Times"/>
+          <w:rtl w:val="0"/>
+        </w:rPr>
+        <w:t>2+)</w:t>
       </w:r>
     </w:p>
     <w:p>
@@ -481,7 +544,27 @@
           <w:rtl w:val="0"/>
           <w:lang w:val="en-US"/>
         </w:rPr>
-        <w:t>I had someone approach me at a conference to thank me because thanks to the contents on my course they were able to get their first job as a developer.</w:t>
+        <w:t xml:space="preserve">I had someone approach me at a conference to thank me because thanks to the contents on my course they were able to </w:t>
+      </w:r>
+      <w:r>
+        <w:rPr>
+          <w:rFonts w:ascii="Times" w:hAnsi="Times"/>
+          <w:b w:val="0"/>
+          <w:bCs w:val="0"/>
+          <w:rtl w:val="0"/>
+          <w:lang w:val="en-US"/>
+        </w:rPr>
+        <w:t>land</w:t>
+      </w:r>
+      <w:r>
+        <w:rPr>
+          <w:rFonts w:ascii="Times" w:hAnsi="Times"/>
+          <w:b w:val="0"/>
+          <w:bCs w:val="0"/>
+          <w:rtl w:val="0"/>
+          <w:lang w:val="en-US"/>
+        </w:rPr>
+        <w:t xml:space="preserve"> their first job as a developer.</w:t>
       </w:r>
     </w:p>
     <w:p>
@@ -625,59 +708,6 @@
           <w:lang w:val="en-US"/>
         </w:rPr>
         <w:t>Full work experience available on my website at https://sergiocruz.me</w:t>
-      </w:r>
-    </w:p>
-    <w:p>
-      <w:pPr>
-        <w:pStyle w:val="Body"/>
-        <w:rPr>
-          <w:rFonts w:ascii="Times" w:cs="Times" w:hAnsi="Times" w:eastAsia="Times"/>
-        </w:rPr>
-      </w:pPr>
-    </w:p>
-    <w:p>
-      <w:pPr>
-        <w:pStyle w:val="Body"/>
-        <w:rPr>
-          <w:rFonts w:ascii="Times" w:cs="Times" w:hAnsi="Times" w:eastAsia="Times"/>
-          <w:b w:val="1"/>
-          <w:bCs w:val="1"/>
-        </w:rPr>
-      </w:pPr>
-      <w:r>
-        <w:rPr>
-          <w:rFonts w:ascii="Times" w:hAnsi="Times"/>
-          <w:b w:val="1"/>
-          <w:bCs w:val="1"/>
-          <w:rtl w:val="0"/>
-          <w:lang w:val="en-US"/>
-        </w:rPr>
-        <w:t>Education</w:t>
-      </w:r>
-    </w:p>
-    <w:p>
-      <w:pPr>
-        <w:pStyle w:val="Body"/>
-        <w:rPr>
-          <w:rFonts w:ascii="Times" w:cs="Times" w:hAnsi="Times" w:eastAsia="Times"/>
-        </w:rPr>
-      </w:pPr>
-      <w:r>
-        <w:rPr>
-          <w:rFonts w:ascii="Times" w:hAnsi="Times"/>
-          <w:rtl w:val="0"/>
-          <w:lang w:val="en-US"/>
-        </w:rPr>
-        <w:t xml:space="preserve">University of Central Florida: B.S. in Computer Science </w:t>
-      </w:r>
-      <w:r>
-        <w:rPr>
-          <w:rFonts w:ascii="Times" w:hAnsi="Times"/>
-          <w:i w:val="1"/>
-          <w:iCs w:val="1"/>
-          <w:rtl w:val="0"/>
-        </w:rPr>
-        <w:t>(incomplete)</w:t>
       </w:r>
     </w:p>
     <w:p>
@@ -875,7 +905,7 @@
         <w:rtl w:val="0"/>
         <w:lang w:val="en-US"/>
       </w:rPr>
-      <w:t>Orlando, FL - Phone.: (407) six-nine-four 8175 - Email.: hello[at]sergiocruz.me</w:t>
+      <w:t>Orlando, FL - Phone: (407) six-nine-four 8175 - Email: hello[at]sergiocruz.me</w:t>
     </w:r>
   </w:p>
 </w:hdr>

</xml_diff>